<commit_message>
prepare for the exam not finished
</commit_message>
<xml_diff>
--- a/SWARD/Exercises/Exercise 3.docx
+++ b/SWARD/Exercises/Exercise 3.docx
@@ -133,7 +133,21 @@
         <w:rPr>
           <w:color w:val="000000" w:themeColor="text1"/>
         </w:rPr>
-        <w:t>A Server-Side Templating (SSR/SST) approach is a web architecture where the server generates complete HTML pages on each request by combining data with predefined templates, and then sends fully rendered pages directly to the browser. The browser’s role is mainly to display these HTML pages, and each user interaction often results in a new request to the server and a full page reload. This approach simplifies the frontend and generally provides better SEO and broader device compatibility, since no heavy JavaScript is required. However, it can increase server load because the server is responsible for rendering pages and may result in a less smooth, more traditional web experience compared to SPAs.</w:t>
+        <w:t xml:space="preserve">A Server-Side Templating (SSR/SST) approach is a web architecture where the server generates complete HTML pages on each request by combining data with predefined </w:t>
+      </w:r>
+      <w:proofErr w:type="gramStart"/>
+      <w:r>
+        <w:rPr>
+          <w:color w:val="000000" w:themeColor="text1"/>
+        </w:rPr>
+        <w:t>templates, and</w:t>
+      </w:r>
+      <w:proofErr w:type="gramEnd"/>
+      <w:r>
+        <w:rPr>
+          <w:color w:val="000000" w:themeColor="text1"/>
+        </w:rPr>
+        <w:t xml:space="preserve"> then sends fully rendered pages directly to the browser. The browser’s role is mainly to display these HTML pages, and each user interaction often results in a new request to the server and a full page reload. This approach simplifies the frontend and generally provides better SEO and broader device compatibility, since no heavy JavaScript is required. However, it can increase server load because the server is responsible for rendering pages and may result in a less smooth, more traditional web experience compared to SPAs.</w:t>
       </w:r>
     </w:p>
     <w:tbl>
@@ -476,7 +490,15 @@
               </w:rPr>
             </w:pPr>
             <w:r>
-              <w:t>0 (Traditional page reload UX, less dynamic)</w:t>
+              <w:t xml:space="preserve">0 (Traditional </w:t>
+            </w:r>
+            <w:proofErr w:type="gramStart"/>
+            <w:r>
+              <w:t>page</w:t>
+            </w:r>
+            <w:proofErr w:type="gramEnd"/>
+            <w:r>
+              <w:t xml:space="preserve"> reload UX, less dynamic)</w:t>
             </w:r>
           </w:p>
         </w:tc>
@@ -824,12 +846,21 @@
           <w:lang w:val="en-US"/>
         </w:rPr>
       </w:pPr>
-      <w:r>
-        <w:rPr>
-          <w:color w:val="000000" w:themeColor="text1"/>
-          <w:lang w:val="en-US"/>
-        </w:rPr>
-        <w:t>First we have the context, which is the usage context and the business context, how many users use it, using which web browser and what do we do and in what quantity</w:t>
+      <w:proofErr w:type="gramStart"/>
+      <w:r>
+        <w:rPr>
+          <w:color w:val="000000" w:themeColor="text1"/>
+          <w:lang w:val="en-US"/>
+        </w:rPr>
+        <w:t>First</w:t>
+      </w:r>
+      <w:proofErr w:type="gramEnd"/>
+      <w:r>
+        <w:rPr>
+          <w:color w:val="000000" w:themeColor="text1"/>
+          <w:lang w:val="en-US"/>
+        </w:rPr>
+        <w:t xml:space="preserve"> we have the context, which is the usage context and the business context, how many users use it, using which web browser and what do we do and in what quantity</w:t>
       </w:r>
     </w:p>
     <w:p>
@@ -849,7 +880,23 @@
           <w:color w:val="000000" w:themeColor="text1"/>
           <w:lang w:val="en-US"/>
         </w:rPr>
-        <w:t xml:space="preserve">Constraints, we have organizational, technological, and the quality attributes being evaluated. </w:t>
+        <w:t xml:space="preserve">Constraints, we have organizational, technological, and </w:t>
+      </w:r>
+      <w:proofErr w:type="gramStart"/>
+      <w:r>
+        <w:rPr>
+          <w:color w:val="000000" w:themeColor="text1"/>
+          <w:lang w:val="en-US"/>
+        </w:rPr>
+        <w:t>the quality</w:t>
+      </w:r>
+      <w:proofErr w:type="gramEnd"/>
+      <w:r>
+        <w:rPr>
+          <w:color w:val="000000" w:themeColor="text1"/>
+          <w:lang w:val="en-US"/>
+        </w:rPr>
+        <w:t xml:space="preserve"> attributes being evaluated. </w:t>
       </w:r>
     </w:p>
     <w:p>
@@ -889,7 +936,23 @@
           <w:color w:val="000000" w:themeColor="text1"/>
           <w:lang w:val="en-US"/>
         </w:rPr>
-        <w:t xml:space="preserve">from what I see we analyze the project management style, agile vs waterfall. We look how many teams we have and if we have any </w:t>
+        <w:t xml:space="preserve">from what I see we analyze the project management style, agile vs waterfall. We </w:t>
+      </w:r>
+      <w:proofErr w:type="gramStart"/>
+      <w:r>
+        <w:rPr>
+          <w:color w:val="000000" w:themeColor="text1"/>
+          <w:lang w:val="en-US"/>
+        </w:rPr>
+        <w:t>look</w:t>
+      </w:r>
+      <w:proofErr w:type="gramEnd"/>
+      <w:r>
+        <w:rPr>
+          <w:color w:val="000000" w:themeColor="text1"/>
+          <w:lang w:val="en-US"/>
+        </w:rPr>
+        <w:t xml:space="preserve"> how many teams we have and if we have any </w:t>
       </w:r>
       <w:proofErr w:type="spellStart"/>
       <w:r>
@@ -959,7 +1022,23 @@
           <w:color w:val="000000" w:themeColor="text1"/>
           <w:lang w:val="en-US"/>
         </w:rPr>
-        <w:t xml:space="preserve">where are we deploying our project and what other tech we are going to use, if we are evaluating the front end decision, which backend are we using. </w:t>
+        <w:t xml:space="preserve">where are we deploying our project and what other tech we are going to use, if we are evaluating the </w:t>
+      </w:r>
+      <w:proofErr w:type="gramStart"/>
+      <w:r>
+        <w:rPr>
+          <w:color w:val="000000" w:themeColor="text1"/>
+          <w:lang w:val="en-US"/>
+        </w:rPr>
+        <w:t>front end</w:t>
+      </w:r>
+      <w:proofErr w:type="gramEnd"/>
+      <w:r>
+        <w:rPr>
+          <w:color w:val="000000" w:themeColor="text1"/>
+          <w:lang w:val="en-US"/>
+        </w:rPr>
+        <w:t xml:space="preserve"> decision, which backend are we using. </w:t>
       </w:r>
     </w:p>
     <w:p>
@@ -1129,22 +1208,54 @@
           <w:color w:val="000000" w:themeColor="text1"/>
           <w:lang w:val="en-US"/>
         </w:rPr>
-        <w:t>#ADR-001: Choosing The Programming Language Java vs Python</w:t>
-      </w:r>
-    </w:p>
-    <w:p>
-      <w:pPr>
-        <w:rPr>
-          <w:color w:val="000000" w:themeColor="text1"/>
-          <w:lang w:val="en-US"/>
-        </w:rPr>
-      </w:pPr>
-      <w:r>
-        <w:rPr>
-          <w:color w:val="000000" w:themeColor="text1"/>
-          <w:lang w:val="en-US"/>
-        </w:rPr>
-        <w:t xml:space="preserve">In this ADR we decide on which programming language are we going to base our </w:t>
+        <w:t xml:space="preserve">#ADR-001: Choosing </w:t>
+      </w:r>
+      <w:proofErr w:type="gramStart"/>
+      <w:r>
+        <w:rPr>
+          <w:color w:val="000000" w:themeColor="text1"/>
+          <w:lang w:val="en-US"/>
+        </w:rPr>
+        <w:t>The</w:t>
+      </w:r>
+      <w:proofErr w:type="gramEnd"/>
+      <w:r>
+        <w:rPr>
+          <w:color w:val="000000" w:themeColor="text1"/>
+          <w:lang w:val="en-US"/>
+        </w:rPr>
+        <w:t xml:space="preserve"> Programming Language Java vs Python</w:t>
+      </w:r>
+    </w:p>
+    <w:p>
+      <w:pPr>
+        <w:rPr>
+          <w:color w:val="000000" w:themeColor="text1"/>
+          <w:lang w:val="en-US"/>
+        </w:rPr>
+      </w:pPr>
+      <w:r>
+        <w:rPr>
+          <w:color w:val="000000" w:themeColor="text1"/>
+          <w:lang w:val="en-US"/>
+        </w:rPr>
+        <w:t xml:space="preserve">In this ADR we decide on which programming language </w:t>
+      </w:r>
+      <w:proofErr w:type="gramStart"/>
+      <w:r>
+        <w:rPr>
+          <w:color w:val="000000" w:themeColor="text1"/>
+          <w:lang w:val="en-US"/>
+        </w:rPr>
+        <w:t>are we</w:t>
+      </w:r>
+      <w:proofErr w:type="gramEnd"/>
+      <w:r>
+        <w:rPr>
+          <w:color w:val="000000" w:themeColor="text1"/>
+          <w:lang w:val="en-US"/>
+        </w:rPr>
+        <w:t xml:space="preserve"> going to base our </w:t>
       </w:r>
       <w:proofErr w:type="spellStart"/>
       <w:r>
@@ -1198,7 +1309,23 @@
           <w:color w:val="000000" w:themeColor="text1"/>
           <w:lang w:val="en-US"/>
         </w:rPr>
-        <w:t xml:space="preserve">We have a website to help 2 player play </w:t>
+        <w:t xml:space="preserve">We have a website to help 2 </w:t>
+      </w:r>
+      <w:proofErr w:type="gramStart"/>
+      <w:r>
+        <w:rPr>
+          <w:color w:val="000000" w:themeColor="text1"/>
+          <w:lang w:val="en-US"/>
+        </w:rPr>
+        <w:t>player</w:t>
+      </w:r>
+      <w:proofErr w:type="gramEnd"/>
+      <w:r>
+        <w:rPr>
+          <w:color w:val="000000" w:themeColor="text1"/>
+          <w:lang w:val="en-US"/>
+        </w:rPr>
+        <w:t xml:space="preserve"> play </w:t>
       </w:r>
       <w:proofErr w:type="spellStart"/>
       <w:r>
@@ -1355,7 +1482,23 @@
           <w:color w:val="000000" w:themeColor="text1"/>
           <w:lang w:val="en-US"/>
         </w:rPr>
-        <w:t xml:space="preserve"> all of our Devs know Java and have basic knowledge of </w:t>
+        <w:t xml:space="preserve"> </w:t>
+      </w:r>
+      <w:proofErr w:type="gramStart"/>
+      <w:r>
+        <w:rPr>
+          <w:color w:val="000000" w:themeColor="text1"/>
+          <w:lang w:val="en-US"/>
+        </w:rPr>
+        <w:t>all of</w:t>
+      </w:r>
+      <w:proofErr w:type="gramEnd"/>
+      <w:r>
+        <w:rPr>
+          <w:color w:val="000000" w:themeColor="text1"/>
+          <w:lang w:val="en-US"/>
+        </w:rPr>
+        <w:t xml:space="preserve"> our Devs know Java and have basic knowledge of </w:t>
       </w:r>
       <w:proofErr w:type="spellStart"/>
       <w:r>
@@ -2164,7 +2307,23 @@
           <w:color w:val="000000" w:themeColor="text1"/>
           <w:lang w:val="en-US"/>
         </w:rPr>
-        <w:t xml:space="preserve">We have a website to help 2 player play </w:t>
+        <w:t xml:space="preserve">We have a website to help 2 </w:t>
+      </w:r>
+      <w:proofErr w:type="gramStart"/>
+      <w:r>
+        <w:rPr>
+          <w:color w:val="000000" w:themeColor="text1"/>
+          <w:lang w:val="en-US"/>
+        </w:rPr>
+        <w:t>player</w:t>
+      </w:r>
+      <w:proofErr w:type="gramEnd"/>
+      <w:r>
+        <w:rPr>
+          <w:color w:val="000000" w:themeColor="text1"/>
+          <w:lang w:val="en-US"/>
+        </w:rPr>
+        <w:t xml:space="preserve"> play </w:t>
       </w:r>
       <w:proofErr w:type="spellStart"/>
       <w:r>
@@ -2281,7 +2440,23 @@
           <w:color w:val="000000" w:themeColor="text1"/>
           <w:lang w:val="en-US"/>
         </w:rPr>
-        <w:t xml:space="preserve">We have 3 developers 2 in Aschaffenburg and 1 in Mainz, we operate using Agile methodologies </w:t>
+        <w:t xml:space="preserve">We have 3 </w:t>
+      </w:r>
+      <w:proofErr w:type="gramStart"/>
+      <w:r>
+        <w:rPr>
+          <w:color w:val="000000" w:themeColor="text1"/>
+          <w:lang w:val="en-US"/>
+        </w:rPr>
+        <w:t>developers</w:t>
+      </w:r>
+      <w:proofErr w:type="gramEnd"/>
+      <w:r>
+        <w:rPr>
+          <w:color w:val="000000" w:themeColor="text1"/>
+          <w:lang w:val="en-US"/>
+        </w:rPr>
+        <w:t xml:space="preserve"> 2 in Aschaffenburg and 1 in Mainz, we operate using Agile methodologies </w:t>
       </w:r>
     </w:p>
     <w:p>
@@ -2300,12 +2475,21 @@
         </w:rPr>
         <w:t xml:space="preserve">Technical:  </w:t>
       </w:r>
-      <w:r>
-        <w:rPr>
-          <w:color w:val="000000" w:themeColor="text1"/>
-          <w:lang w:val="en-US"/>
-        </w:rPr>
-        <w:t xml:space="preserve">all of our developers know </w:t>
+      <w:proofErr w:type="gramStart"/>
+      <w:r>
+        <w:rPr>
+          <w:color w:val="000000" w:themeColor="text1"/>
+          <w:lang w:val="en-US"/>
+        </w:rPr>
+        <w:t>all of</w:t>
+      </w:r>
+      <w:proofErr w:type="gramEnd"/>
+      <w:r>
+        <w:rPr>
+          <w:color w:val="000000" w:themeColor="text1"/>
+          <w:lang w:val="en-US"/>
+        </w:rPr>
+        <w:t xml:space="preserve"> our developers know </w:t>
       </w:r>
       <w:proofErr w:type="spellStart"/>
       <w:r>
@@ -2355,91 +2539,23 @@
           <w:color w:val="000000" w:themeColor="text1"/>
           <w:lang w:val="en-US"/>
         </w:rPr>
-        <w:t>-1-</w:t>
-      </w:r>
-      <w:r>
-        <w:rPr>
-          <w:color w:val="000000" w:themeColor="text1"/>
-          <w:lang w:val="en-US"/>
-        </w:rPr>
-        <w:t xml:space="preserve"> Functional Suitability  </w:t>
-      </w:r>
-      <w:r>
-        <w:rPr>
-          <w:color w:val="000000" w:themeColor="text1"/>
-          <w:lang w:val="en-US"/>
-        </w:rPr>
-        <w:t xml:space="preserve"> </w:t>
-      </w:r>
-      <w:r>
-        <w:rPr>
-          <w:color w:val="000000" w:themeColor="text1"/>
-          <w:lang w:val="en-US"/>
-        </w:rPr>
-        <w:t>-2-</w:t>
-      </w:r>
-      <w:r>
-        <w:rPr>
-          <w:color w:val="000000" w:themeColor="text1"/>
-          <w:lang w:val="en-US"/>
-        </w:rPr>
-        <w:t xml:space="preserve">Usability </w:t>
-      </w:r>
-      <w:r>
-        <w:rPr>
-          <w:color w:val="000000" w:themeColor="text1"/>
-          <w:lang w:val="en-US"/>
-        </w:rPr>
-        <w:t xml:space="preserve"> </w:t>
-      </w:r>
-      <w:r>
-        <w:rPr>
-          <w:color w:val="000000" w:themeColor="text1"/>
-          <w:lang w:val="en-US"/>
-        </w:rPr>
-        <w:t>-</w:t>
-      </w:r>
-      <w:r>
-        <w:rPr>
-          <w:color w:val="000000" w:themeColor="text1"/>
-          <w:lang w:val="en-US"/>
-        </w:rPr>
-        <w:t>3</w:t>
-      </w:r>
-      <w:r>
-        <w:rPr>
-          <w:color w:val="000000" w:themeColor="text1"/>
-          <w:lang w:val="en-US"/>
-        </w:rPr>
-        <w:t>- portability -</w:t>
-      </w:r>
-      <w:r>
-        <w:rPr>
-          <w:color w:val="000000" w:themeColor="text1"/>
-          <w:lang w:val="en-US"/>
-        </w:rPr>
-        <w:t>4</w:t>
-      </w:r>
-      <w:r>
-        <w:rPr>
-          <w:color w:val="000000" w:themeColor="text1"/>
-          <w:lang w:val="en-US"/>
-        </w:rPr>
-        <w:t>- reliability -</w:t>
-      </w:r>
-      <w:r>
-        <w:rPr>
-          <w:color w:val="000000" w:themeColor="text1"/>
-          <w:lang w:val="en-US"/>
-        </w:rPr>
-        <w:t>5</w:t>
-      </w:r>
-      <w:r>
-        <w:rPr>
-          <w:color w:val="000000" w:themeColor="text1"/>
-          <w:lang w:val="en-US"/>
-        </w:rPr>
-        <w:t>- maintainability</w:t>
+        <w:t>-1- Functional Suitability   -2-</w:t>
+      </w:r>
+      <w:proofErr w:type="gramStart"/>
+      <w:r>
+        <w:rPr>
+          <w:color w:val="000000" w:themeColor="text1"/>
+          <w:lang w:val="en-US"/>
+        </w:rPr>
+        <w:t>Usability  -</w:t>
+      </w:r>
+      <w:proofErr w:type="gramEnd"/>
+      <w:r>
+        <w:rPr>
+          <w:color w:val="000000" w:themeColor="text1"/>
+          <w:lang w:val="en-US"/>
+        </w:rPr>
+        <w:t>3- portability -4- reliability -5- maintainability</w:t>
       </w:r>
     </w:p>
     <w:p>
@@ -3002,7 +3118,19 @@
         <w:rPr>
           <w:color w:val="000000" w:themeColor="text1"/>
         </w:rPr>
-        <w:t>We will be moving forward with the SAP since we prioritise the usability more in this application</w:t>
+        <w:t>We will be moving forward with the SP</w:t>
+      </w:r>
+      <w:r>
+        <w:rPr>
+          <w:color w:val="000000" w:themeColor="text1"/>
+        </w:rPr>
+        <w:t>A</w:t>
+      </w:r>
+      <w:r>
+        <w:rPr>
+          <w:color w:val="000000" w:themeColor="text1"/>
+        </w:rPr>
+        <w:t xml:space="preserve"> since we prioritise the usability more in this application</w:t>
       </w:r>
     </w:p>
     <w:p>
@@ -3063,7 +3191,21 @@
         <w:rPr>
           <w:color w:val="000000" w:themeColor="text1"/>
         </w:rPr>
-        <w:t>portability will be harder to maintain, and not SEO  friendly.</w:t>
+        <w:t xml:space="preserve">portability will be harder to maintain, and not </w:t>
+      </w:r>
+      <w:proofErr w:type="gramStart"/>
+      <w:r>
+        <w:rPr>
+          <w:color w:val="000000" w:themeColor="text1"/>
+        </w:rPr>
+        <w:t>SEO  friendly</w:t>
+      </w:r>
+      <w:proofErr w:type="gramEnd"/>
+      <w:r>
+        <w:rPr>
+          <w:color w:val="000000" w:themeColor="text1"/>
+        </w:rPr>
+        <w:t>.</w:t>
       </w:r>
     </w:p>
     <w:p>
@@ -3324,7 +3466,23 @@
           <w:color w:val="000000" w:themeColor="text1"/>
           <w:lang w:val="en-US"/>
         </w:rPr>
-        <w:t>-1- Functional Suitability   -2-Usability  -3- portability -4- reliability -5- maintainability</w:t>
+        <w:t>-1- Functional Suitability   -2-</w:t>
+      </w:r>
+      <w:proofErr w:type="gramStart"/>
+      <w:r>
+        <w:rPr>
+          <w:color w:val="000000" w:themeColor="text1"/>
+          <w:lang w:val="en-US"/>
+        </w:rPr>
+        <w:t>Usability  -</w:t>
+      </w:r>
+      <w:proofErr w:type="gramEnd"/>
+      <w:r>
+        <w:rPr>
+          <w:color w:val="000000" w:themeColor="text1"/>
+          <w:lang w:val="en-US"/>
+        </w:rPr>
+        <w:t>3- portability -4- reliability -5- maintainability</w:t>
       </w:r>
     </w:p>
     <w:p>
@@ -3376,7 +3534,21 @@
         <w:rPr>
           <w:color w:val="000000" w:themeColor="text1"/>
         </w:rPr>
-        <w:t>A lightweight Java framework that simplifies the development of web applications and REST APIs through auto-configuration and convention-over-configuration.</w:t>
+        <w:t xml:space="preserve">A lightweight Java framework that simplifies the development of web applications and REST APIs through </w:t>
+      </w:r>
+      <w:proofErr w:type="gramStart"/>
+      <w:r>
+        <w:rPr>
+          <w:color w:val="000000" w:themeColor="text1"/>
+        </w:rPr>
+        <w:t>auto-configuration</w:t>
+      </w:r>
+      <w:proofErr w:type="gramEnd"/>
+      <w:r>
+        <w:rPr>
+          <w:color w:val="000000" w:themeColor="text1"/>
+        </w:rPr>
+        <w:t xml:space="preserve"> and convention-over-configuration.</w:t>
       </w:r>
     </w:p>
     <w:p>
@@ -4690,6 +4862,7 @@
   <w:style w:type="character" w:default="1" w:styleId="DefaultParagraphFont">
     <w:name w:val="Default Paragraph Font"/>
     <w:uiPriority w:val="1"/>
+    <w:semiHidden/>
     <w:unhideWhenUsed/>
   </w:style>
   <w:style w:type="table" w:default="1" w:styleId="TableNormal">

</xml_diff>